<commit_message>
Update DOCX sample file
</commit_message>
<xml_diff>
--- a/test-files/DOCX.docx
+++ b/test-files/DOCX.docx
@@ -1149,7 +1149,7 @@
           <w:noProof/>
         </w:rPr>
         <w:drawing>
-          <wp:inline distT="0" distB="0" distL="0" distR="0" wp14:anchorId="04A46042" wp14:editId="310D744E">
+          <wp:inline distT="0" distB="0" distL="0" distR="0" wp14:anchorId="3352BDA8" wp14:editId="08429AE5">
             <wp:extent cx="2103120" cy="1401789"/>
             <wp:effectExtent l="0" t="0" r="0" b="8255"/>
             <wp:docPr id="906299104" name="Immagine 1" descr="Uccello tropicale tucano colorato"/>
@@ -1250,7 +1250,7 @@
         <w:rPr>
           <w:lang w:val="en-US"/>
         </w:rPr>
-        <w:t>Nam liber tempor cum soluta nobis eleifend option congue nihil imperdiet doming id quod mazim placerat facer possim assum.</w:t>
+        <w:t>Nam liber tempor cum soluta nobis eleifend option congue nihil imperdiet doming                     id quod mazim placerat facer possim assum.</w:t>
       </w:r>
     </w:p>
     <w:p>
@@ -1282,7 +1282,7 @@
         <w:rPr>
           <w:lang w:val="en-US"/>
         </w:rPr>
-        <w:t>Nam liber tempor cum soluta nobis eleifend option congue nihil imperdiet doming id quod mazim placerat facer possim assum.</w:t>
+        <w:t>Nam liber tempor cum soluta nobis eleifend option congue nihil imperdiet doming                     id quod mazim placerat facer possim assum.</w:t>
       </w:r>
     </w:p>
     <w:p>

</xml_diff>